<commit_message>
Updated BootPlot and case studies. Added Expt4Tailor case study
</commit_message>
<xml_diff>
--- a/CaseStudies/Gillnets/TroutGillnet.docx
+++ b/CaseStudies/Gillnets/TroutGillnet.docx
@@ -7,19 +7,7 @@
         <w:pStyle w:val="Title"/>
       </w:pPr>
       <w:r>
-        <w:t xml:space="preserve">SELECT</w:t>
-      </w:r>
-      <w:r>
-        <w:t xml:space="preserve"> </w:t>
-      </w:r>
-      <w:r>
-        <w:t xml:space="preserve">package</w:t>
-      </w:r>
-      <w:r>
-        <w:t xml:space="preserve"> </w:t>
-      </w:r>
-      <w:r>
-        <w:t xml:space="preserve">demonstration</w:t>
+        <w:t xml:space="preserve">SELECT package demonstration</w:t>
       </w:r>
       <w:r>
         <w:br/>
@@ -28,7 +16,7 @@
         <w:t xml:space="preserve">Gillnet</w:t>
       </w:r>
     </w:p>
-    <w:bookmarkStart w:id="32" w:name="summary"/>
+    <w:bookmarkStart w:id="21" w:name="summary"/>
     <w:p>
       <w:pPr>
         <w:pStyle w:val="Heading2"/>
@@ -118,7 +106,7 @@
         <w:t xml:space="preserve">Geometric similarity of selectivity curves</w:t>
       </w:r>
     </w:p>
-    <w:bookmarkStart w:id="20" w:name="data-source"/>
+    <w:bookmarkStart w:id="9" w:name="data-source"/>
     <w:p>
       <w:pPr>
         <w:pStyle w:val="Heading3"/>
@@ -153,8 +141,8 @@
         <w:t xml:space="preserve">2483-2490.</w:t>
       </w:r>
     </w:p>
-    <w:bookmarkEnd w:id="20"/>
-    <w:bookmarkStart w:id="21" w:name="load-required-packages"/>
+    <w:bookmarkEnd w:id="9"/>
+    <w:bookmarkStart w:id="10" w:name="load-required-packages"/>
     <w:p>
       <w:pPr>
         <w:pStyle w:val="Heading3"/>
@@ -195,8 +183,8 @@
         <w:t xml:space="preserve">(tidyverse)</w:t>
       </w:r>
     </w:p>
-    <w:bookmarkEnd w:id="21"/>
-    <w:bookmarkStart w:id="22" w:name="load-data"/>
+    <w:bookmarkEnd w:id="10"/>
+    <w:bookmarkStart w:id="11" w:name="load-data"/>
     <w:p>
       <w:pPr>
         <w:pStyle w:val="Heading3"/>
@@ -522,8 +510,8 @@
         <w:t xml:space="preserve">in proportion to mesh size.</w:t>
       </w:r>
     </w:p>
-    <w:bookmarkEnd w:id="22"/>
-    <w:bookmarkStart w:id="23" w:name="fit-the-curves"/>
+    <w:bookmarkEnd w:id="11"/>
+    <w:bookmarkStart w:id="12" w:name="fit-the-curves"/>
     <w:p>
       <w:pPr>
         <w:pStyle w:val="Heading3"/>
@@ -1441,8 +1429,8 @@
         <w:t xml:space="preserve">) has the lowest Poisson AIC of 412.9.</w:t>
       </w:r>
     </w:p>
-    <w:bookmarkEnd w:id="23"/>
-    <w:bookmarkStart w:id="27" w:name="check-goodness-of-fit-of-preferred-model"/>
+    <w:bookmarkEnd w:id="12"/>
+    <w:bookmarkStart w:id="16" w:name="check-goodness-of-fit-of-preferred-model"/>
     <w:p>
       <w:pPr>
         <w:pStyle w:val="Heading3"/>
@@ -1477,18 +1465,18 @@
           <wp:inline>
             <wp:extent cx="4620126" cy="3234088"/>
             <wp:effectExtent b="0" l="0" r="0" t="0"/>
-            <wp:docPr descr="" title="" id="25" name="Picture"/>
+            <wp:docPr descr="" title="" id="14" name="Picture"/>
             <a:graphic>
               <a:graphicData uri="http://schemas.openxmlformats.org/drawingml/2006/picture">
                 <pic:pic>
                   <pic:nvPicPr>
-                    <pic:cNvPr descr="TroutGillnet_files/figure-docx/unnamed-chunk-5-1.png" id="26" name="Picture"/>
+                    <pic:cNvPr descr="../figures/unnamed-chunk-5-1.png" id="15" name="Picture"/>
                     <pic:cNvPicPr>
                       <a:picLocks noChangeArrowheads="1" noChangeAspect="1"/>
                     </pic:cNvPicPr>
                   </pic:nvPicPr>
                   <pic:blipFill>
-                    <a:blip r:embed="rId24"/>
+                    <a:blip r:embed="rId13"/>
                     <a:stretch>
                       <a:fillRect/>
                     </a:stretch>
@@ -1532,7 +1520,7 @@
         <w:rPr>
           <w:rStyle w:val="VerbatimChar"/>
         </w:rPr>
-        <w:t xml:space="preserve">##     null.l    model.l     full.l       npar        AIC </w:t>
+        <w:t xml:space="preserve">##     null.l    model.l     full.l       npar        AIC        BIC </w:t>
       </w:r>
       <w:r>
         <w:br/>
@@ -1541,7 +1529,7 @@
         <w:rPr>
           <w:rStyle w:val="VerbatimChar"/>
         </w:rPr>
-        <w:t xml:space="preserve">## -212.74398 -136.47462  -98.71324    5.00000  282.94924 </w:t>
+        <w:t xml:space="preserve">## -212.74398 -136.47462  -98.71324    5.00000  282.94924  294.33257 </w:t>
       </w:r>
       <w:r>
         <w:br/>
@@ -1673,8 +1661,8 @@
         <w:t xml:space="preserve">reasonable. The plot of deviances residuals does not dispay any concerning patterns.</w:t>
       </w:r>
     </w:p>
-    <w:bookmarkEnd w:id="27"/>
-    <w:bookmarkStart w:id="31" w:name="plot-the-master-selection-curve"/>
+    <w:bookmarkEnd w:id="16"/>
+    <w:bookmarkStart w:id="20" w:name="plot-the-master-selection-curve"/>
     <w:p>
       <w:pPr>
         <w:pStyle w:val="Heading3"/>
@@ -1711,6 +1699,63 @@
         <w:rPr>
           <w:rStyle w:val="AttributeTok"/>
         </w:rPr>
+        <w:t xml:space="preserve">mfrow=</w:t>
+      </w:r>
+      <w:r>
+        <w:rPr>
+          <w:rStyle w:val="FunctionTok"/>
+        </w:rPr>
+        <w:t xml:space="preserve">c</w:t>
+      </w:r>
+      <w:r>
+        <w:rPr>
+          <w:rStyle w:val="NormalTok"/>
+        </w:rPr>
+        <w:t xml:space="preserve">(</w:t>
+      </w:r>
+      <w:r>
+        <w:rPr>
+          <w:rStyle w:val="DecValTok"/>
+        </w:rPr>
+        <w:t xml:space="preserve">1</w:t>
+      </w:r>
+      <w:r>
+        <w:rPr>
+          <w:rStyle w:val="NormalTok"/>
+        </w:rPr>
+        <w:t xml:space="preserve">,</w:t>
+      </w:r>
+      <w:r>
+        <w:rPr>
+          <w:rStyle w:val="DecValTok"/>
+        </w:rPr>
+        <w:t xml:space="preserve">2</w:t>
+      </w:r>
+      <w:r>
+        <w:rPr>
+          <w:rStyle w:val="NormalTok"/>
+        </w:rPr>
+        <w:t xml:space="preserve">))</w:t>
+      </w:r>
+      <w:r>
+        <w:br/>
+      </w:r>
+      <w:r>
+        <w:rPr>
+          <w:rStyle w:val="FunctionTok"/>
+        </w:rPr>
+        <w:t xml:space="preserve">par</w:t>
+      </w:r>
+      <w:r>
+        <w:rPr>
+          <w:rStyle w:val="NormalTok"/>
+        </w:rPr>
+        <w:t xml:space="preserve">(</w:t>
+      </w:r>
+      <w:r>
+        <w:rPr>
+          <w:rStyle w:val="AttributeTok"/>
+        </w:rPr>
         <w:t xml:space="preserve">oma=</w:t>
       </w:r>
       <w:r>
@@ -1831,13 +1876,31 @@
         <w:rPr>
           <w:rStyle w:val="DecValTok"/>
         </w:rPr>
-        <w:t xml:space="preserve">4</w:t>
-      </w:r>
-      <w:r>
-        <w:rPr>
-          <w:rStyle w:val="NormalTok"/>
-        </w:rPr>
-        <w:t xml:space="preserve">)) </w:t>
+        <w:t xml:space="preserve">2</w:t>
+      </w:r>
+      <w:r>
+        <w:rPr>
+          <w:rStyle w:val="NormalTok"/>
+        </w:rPr>
+        <w:t xml:space="preserve">),</w:t>
+      </w:r>
+      <w:r>
+        <w:rPr>
+          <w:rStyle w:val="AttributeTok"/>
+        </w:rPr>
+        <w:t xml:space="preserve">las=</w:t>
+      </w:r>
+      <w:r>
+        <w:rPr>
+          <w:rStyle w:val="DecValTok"/>
+        </w:rPr>
+        <w:t xml:space="preserve">1</w:t>
+      </w:r>
+      <w:r>
+        <w:rPr>
+          <w:rStyle w:val="NormalTok"/>
+        </w:rPr>
+        <w:t xml:space="preserve">) </w:t>
       </w:r>
       <w:r>
         <w:br/>
@@ -1864,7 +1927,19 @@
         <w:rPr>
           <w:rStyle w:val="NormalTok"/>
         </w:rPr>
-        <w:t xml:space="preserve">T) </w:t>
+        <w:t xml:space="preserve">T,</w:t>
+      </w:r>
+      <w:r>
+        <w:rPr>
+          <w:rStyle w:val="AttributeTok"/>
+        </w:rPr>
+        <w:t xml:space="preserve">Master=</w:t>
+      </w:r>
+      <w:r>
+        <w:rPr>
+          <w:rStyle w:val="NormalTok"/>
+        </w:rPr>
+        <w:t xml:space="preserve">F) </w:t>
       </w:r>
       <w:r>
         <w:rPr>
@@ -2020,7 +2095,52 @@
         <w:rPr>
           <w:rStyle w:val="FloatTok"/>
         </w:rPr>
-        <w:t xml:space="preserve">0.8</w:t>
+        <w:t xml:space="preserve">0.7</w:t>
+      </w:r>
+      <w:r>
+        <w:rPr>
+          <w:rStyle w:val="NormalTok"/>
+        </w:rPr>
+        <w:t xml:space="preserve">)</w:t>
+      </w:r>
+      <w:r>
+        <w:br/>
+      </w:r>
+      <w:r>
+        <w:rPr>
+          <w:rStyle w:val="FunctionTok"/>
+        </w:rPr>
+        <w:t xml:space="preserve">plot</w:t>
+      </w:r>
+      <w:r>
+        <w:rPr>
+          <w:rStyle w:val="NormalTok"/>
+        </w:rPr>
+        <w:t xml:space="preserve">(SEL5,</w:t>
+      </w:r>
+      <w:r>
+        <w:rPr>
+          <w:rStyle w:val="AttributeTok"/>
+        </w:rPr>
+        <w:t xml:space="preserve">standardize=</w:t>
+      </w:r>
+      <w:r>
+        <w:rPr>
+          <w:rStyle w:val="NormalTok"/>
+        </w:rPr>
+        <w:t xml:space="preserve">T,</w:t>
+      </w:r>
+      <w:r>
+        <w:rPr>
+          <w:rStyle w:val="AttributeTok"/>
+        </w:rPr>
+        <w:t xml:space="preserve">ylab=</w:t>
+      </w:r>
+      <w:r>
+        <w:rPr>
+          <w:rStyle w:val="StringTok"/>
+        </w:rPr>
+        <w:t xml:space="preserve">"Primary curve"</w:t>
       </w:r>
       <w:r>
         <w:rPr>
@@ -2036,20 +2156,20 @@
       <w:r>
         <w:drawing>
           <wp:inline>
-            <wp:extent cx="5334000" cy="3429000"/>
+            <wp:extent cx="5334000" cy="2133599"/>
             <wp:effectExtent b="0" l="0" r="0" t="0"/>
-            <wp:docPr descr="" title="" id="29" name="Picture"/>
+            <wp:docPr descr="" title="" id="18" name="Picture"/>
             <a:graphic>
               <a:graphicData uri="http://schemas.openxmlformats.org/drawingml/2006/picture">
                 <pic:pic>
                   <pic:nvPicPr>
-                    <pic:cNvPr descr="TroutGillnet_files/figure-docx/unnamed-chunk-6-1.png" id="30" name="Picture"/>
+                    <pic:cNvPr descr="../figures/GN-SelnCurves-1.png" id="19" name="Picture"/>
                     <pic:cNvPicPr>
                       <a:picLocks noChangeArrowheads="1" noChangeAspect="1"/>
                     </pic:cNvPicPr>
                   </pic:nvPicPr>
                   <pic:blipFill>
-                    <a:blip r:embed="rId28"/>
+                    <a:blip r:embed="rId17"/>
                     <a:stretch>
                       <a:fillRect/>
                     </a:stretch>
@@ -2057,7 +2177,7 @@
                   <pic:spPr bwMode="auto">
                     <a:xfrm>
                       <a:off x="0" y="0"/>
-                      <a:ext cx="5334000" cy="3429000"/>
+                      <a:ext cx="5334000" cy="2133599"/>
                     </a:xfrm>
                     <a:prstGeom prst="rect">
                       <a:avLst/>
@@ -2076,9 +2196,13 @@
         </w:drawing>
       </w:r>
     </w:p>
-    <w:bookmarkEnd w:id="31"/>
-    <w:bookmarkEnd w:id="32"/>
-    <w:sectPr/>
+    <w:bookmarkEnd w:id="20"/>
+    <w:bookmarkEnd w:id="21"/>
+    <w:sectPr>
+      <w:footnotePr>
+        <w:numRestart w:val="eachSect"/>
+      </w:footnotePr>
+    </w:sectPr>
   </w:body>
 </w:document>
 </file>
@@ -2416,10 +2540,10 @@
   <w:docDefaults>
     <w:rPrDefault>
       <w:rPr>
-        <w:rFonts w:asciiTheme="minorHAnsi" w:cstheme="minorBidi" w:eastAsiaTheme="minorHAnsi" w:hAnsiTheme="minorHAnsi"/>
+        <w:rFonts w:asciiTheme="minorHAnsi" w:cstheme="minorBidi" w:eastAsiaTheme="minorEastAsia" w:hAnsiTheme="minorHAnsi"/>
         <w:sz w:val="24"/>
         <w:szCs w:val="24"/>
-        <w:lang w:bidi="ar-SA" w:eastAsia="en-US" w:val="en-US"/>
+        <w:lang w:bidi="ar-SA" w:eastAsia="zh-CN" w:val="en-US"/>
       </w:rPr>
     </w:rPrDefault>
     <w:pPrDefault>
@@ -2471,8 +2595,6 @@
     </w:pPr>
     <w:rPr>
       <w:rFonts w:asciiTheme="majorHAnsi" w:cstheme="majorBidi" w:eastAsiaTheme="majorEastAsia" w:hAnsiTheme="majorHAnsi"/>
-      <w:spacing w:val="-10"/>
-      <w:kern w:val="28"/>
       <w:sz w:val="56"/>
       <w:szCs w:val="56"/>
     </w:rPr>
@@ -2485,15 +2607,13 @@
     <w:rsid w:val="00A10FD9"/>
     <w:rPr>
       <w:rFonts w:asciiTheme="majorHAnsi" w:cstheme="majorBidi" w:eastAsiaTheme="majorEastAsia" w:hAnsiTheme="majorHAnsi"/>
-      <w:spacing w:val="-10"/>
-      <w:kern w:val="28"/>
       <w:sz w:val="56"/>
       <w:szCs w:val="56"/>
     </w:rPr>
   </w:style>
   <w:style w:styleId="Subtitle" w:type="paragraph">
     <w:name w:val="Subtitle"/>
-    <w:basedOn w:val="Normal"/>
+    <w:basedOn w:val="Title"/>
     <w:next w:val="BodyText"/>
     <w:link w:val="SubtitleChar"/>
     <w:uiPriority w:val="11"/>
@@ -2506,7 +2626,6 @@
     </w:pPr>
     <w:rPr>
       <w:rFonts w:cstheme="majorBidi" w:eastAsiaTheme="majorEastAsia"/>
-      <w:color w:themeColor="text1" w:themeTint="A6" w:val="595959"/>
       <w:spacing w:val="15"/>
       <w:sz w:val="28"/>
       <w:szCs w:val="28"/>
@@ -2528,23 +2647,31 @@
   </w:style>
   <w:style w:customStyle="1" w:styleId="Author" w:type="paragraph">
     <w:name w:val="Author"/>
+    <w:basedOn w:val="Title"/>
     <w:next w:val="BodyText"/>
     <w:qFormat/>
     <w:pPr>
       <w:keepNext/>
       <w:keepLines/>
-      <w:jc w:val="center"/>
     </w:pPr>
+    <w:rPr>
+      <w:sz w:val="24"/>
+      <w:szCs w:val="24"/>
+    </w:rPr>
   </w:style>
   <w:style w:styleId="Date" w:type="paragraph">
     <w:name w:val="Date"/>
+    <w:basedOn w:val="Title"/>
     <w:next w:val="BodyText"/>
     <w:qFormat/>
     <w:pPr>
       <w:keepNext/>
       <w:keepLines/>
-      <w:jc w:val="center"/>
     </w:pPr>
+    <w:rPr>
+      <w:sz w:val="24"/>
+      <w:szCs w:val="24"/>
+    </w:rPr>
   </w:style>
   <w:style w:customStyle="1" w:styleId="AbstractTitle" w:type="paragraph">
     <w:name w:val="Abstract Title"/>
@@ -2559,7 +2686,6 @@
     </w:pPr>
     <w:rPr>
       <w:b/>
-      <w:color w:val="345A8A"/>
       <w:sz w:val="20"/>
       <w:szCs w:val="20"/>
     </w:rPr>
@@ -2958,13 +3084,6 @@
       </w:tblCellMar>
     </w:tblPr>
     <w:tblStylePr w:type="firstRow">
-      <w:tblPr>
-        <w:jc w:val="left"/>
-        <w:tblInd w:type="dxa" w:w="0"/>
-      </w:tblPr>
-      <w:trPr>
-        <w:jc w:val="left"/>
-      </w:trPr>
       <w:tcPr>
         <w:tcBorders>
           <w:bottom w:val="single"/>

</xml_diff>